<commit_message>
update Rev.io promotional certificate offer bullets (2026-08-10 10:28 ET)
</commit_message>
<xml_diff>
--- a/revio-promotional-certificate.docx
+++ b/revio-promotional-certificate.docx
@@ -203,7 +203,7 @@
                       <w:sz w:val="26"/>
                       <w:b/>
                     </w:rPr>
-                    <w:t>Unlimited Revii use for 1 year</w:t>
+                    <w:t>$250 credit off of monthly fees for 12 months following onboarding graduation</w:t>
                   </w:r>
                 </w:p>
               </w:tc>
@@ -249,7 +249,7 @@
                       <w:sz w:val="26"/>
                       <w:b/>
                     </w:rPr>
-                    <w:t>2 included field licenses for only $750 per month</w:t>
+                    <w:t>15,000 Revii credits included ($150 value)</w:t>
                   </w:r>
                 </w:p>
               </w:tc>
@@ -295,7 +295,7 @@
                       <w:sz w:val="26"/>
                       <w:b/>
                     </w:rPr>
-                    <w:t>2 tickets to Summit included</w:t>
+                    <w:t>2 Summit tickets ($1,300 value)</w:t>
                   </w:r>
                 </w:p>
               </w:tc>

</xml_diff>

<commit_message>
update Rev.io promotional certificate fields (2026-08-10 10:32 ET)
</commit_message>
<xml_diff>
--- a/revio-promotional-certificate.docx
+++ b/revio-promotional-certificate.docx
@@ -309,7 +309,7 @@
         </w:trPr>
         <w:tc>
           <w:tcPr>
-            <w:tcW w:w="5700" w:type="dxa"/>
+            <w:tcW w:w="4100" w:type="dxa"/>
             <w:tcBorders>
               <w:bottom w:val="single" w:sz="18" w:space="0" w:color="071426"/>
             </w:tcBorders>
@@ -333,7 +333,7 @@
         </w:tc>
         <w:tc>
           <w:tcPr>
-            <w:tcW w:w="4350" w:type="dxa"/>
+            <w:tcW w:w="3500" w:type="dxa"/>
             <w:tcBorders>
               <w:bottom w:val="single" w:sz="18" w:space="0" w:color="071426"/>
             </w:tcBorders>
@@ -351,13 +351,13 @@
                 <w:b/>
                 <w:caps/>
               </w:rPr>
-              <w:t>Location</w:t>
-            </w:r>
-          </w:p>
-        </w:tc>
-        <w:tc>
-          <w:tcPr>
-            <w:tcW w:w="4350" w:type="dxa"/>
+              <w:t>Contact</w:t>
+            </w:r>
+          </w:p>
+        </w:tc>
+        <w:tc>
+          <w:tcPr>
+            <w:tcW w:w="2600" w:type="dxa"/>
             <w:tcBorders>
               <w:bottom w:val="single" w:sz="18" w:space="0" w:color="071426"/>
             </w:tcBorders>
@@ -375,7 +375,31 @@
                 <w:b/>
                 <w:caps/>
               </w:rPr>
-              <w:t>Owner</w:t>
+              <w:t>Date</w:t>
+            </w:r>
+          </w:p>
+        </w:tc>
+        <w:tc>
+          <w:tcPr>
+            <w:tcW w:w="4200" w:type="dxa"/>
+            <w:tcBorders>
+              <w:bottom w:val="single" w:sz="18" w:space="0" w:color="071426"/>
+            </w:tcBorders>
+          </w:tcPr>
+          <w:p/>
+          <w:p>
+            <w:pPr>
+              <w:spacing w:before="80" w:after="0"/>
+            </w:pPr>
+            <w:r>
+              <w:rPr>
+                <w:rFonts w:ascii="Aptos" w:hAnsi="Aptos"/>
+                <w:color w:val="5F6D80"/>
+                <w:sz w:val="18"/>
+                <w:b/>
+                <w:caps/>
+              </w:rPr>
+              <w:t>Sales Represenative</w:t>
             </w:r>
           </w:p>
         </w:tc>

</xml_diff>

<commit_message>
update Rev.io promotional certificate title (2026-08-10 10:37 ET)
</commit_message>
<xml_diff>
--- a/revio-promotional-certificate.docx
+++ b/revio-promotional-certificate.docx
@@ -127,7 +127,7 @@
                 <w:sz w:val="58"/>
                 <w:b/>
               </w:rPr>
-              <w:t>Up to 7 seats for the price of 5!</w:t>
+              <w:t>August Promotion</w:t>
             </w:r>
           </w:p>
           <w:p>
@@ -141,7 +141,7 @@
                 <w:sz w:val="25"/>
                 <w:b/>
               </w:rPr>
-              <w:t>A Rev.io growth package built for teams ready to move faster with Revii and field execution.</w:t>
+              <w:t>A Rev.io growth package built for clients ready to kick-off the fall season with a variety of Rev.io offerings.</w:t>
             </w:r>
           </w:p>
         </w:tc>

</xml_diff>

<commit_message>
clean up Rev.io promotional certificate layout (2026-08-10 11:14 ET)
</commit_message>
<xml_diff>
--- a/revio-promotional-certificate.docx
+++ b/revio-promotional-certificate.docx
@@ -410,7 +410,7 @@
         </w:trPr>
         <w:tc>
           <w:tcPr>
-            <w:tcW w:w="11000" w:type="dxa"/>
+            <w:tcW w:w="14400" w:type="dxa"/>
           </w:tcPr>
           <w:p>
             <w:pPr>
@@ -425,26 +425,6 @@
                 <w:caps/>
               </w:rPr>
               <w:t>Rev.io promotional certificate</w:t>
-            </w:r>
-          </w:p>
-        </w:tc>
-        <w:tc>
-          <w:tcPr>
-            <w:tcW w:w="3400" w:type="dxa"/>
-          </w:tcPr>
-          <w:p>
-            <w:pPr>
-              <w:jc w:val="center"/>
-              <w:spacing w:before="0" w:after="0"/>
-            </w:pPr>
-            <w:r>
-              <w:rPr>
-                <w:rFonts w:ascii="Aptos" w:hAnsi="Aptos"/>
-                <w:color w:val="0057FF"/>
-                <w:sz w:val="15"/>
-                <w:b/>
-              </w:rPr>
-              <w:t>SUMMIT\nPASS\nINCLUDED</w:t>
             </w:r>
           </w:p>
         </w:tc>

</xml_diff>

<commit_message>
add expiration to Rev.io promotional certificate (2026-08-10 13:39 ET)
</commit_message>
<xml_diff>
--- a/revio-promotional-certificate.docx
+++ b/revio-promotional-certificate.docx
@@ -410,7 +410,7 @@
         </w:trPr>
         <w:tc>
           <w:tcPr>
-            <w:tcW w:w="14400" w:type="dxa"/>
+            <w:tcW w:w="7200" w:type="dxa"/>
           </w:tcPr>
           <w:p>
             <w:pPr>
@@ -425,6 +425,27 @@
                 <w:caps/>
               </w:rPr>
               <w:t>Rev.io promotional certificate</w:t>
+            </w:r>
+          </w:p>
+        </w:tc>
+        <w:tc>
+          <w:tcPr>
+            <w:tcW w:w="7200" w:type="dxa"/>
+          </w:tcPr>
+          <w:p>
+            <w:pPr>
+              <w:jc w:val="right"/>
+              <w:spacing w:before="0" w:after="0"/>
+            </w:pPr>
+            <w:r>
+              <w:rPr>
+                <w:rFonts w:ascii="Aptos" w:hAnsi="Aptos"/>
+                <w:color w:val="78869A"/>
+                <w:sz w:val="17"/>
+                <w:b/>
+                <w:caps/>
+              </w:rPr>
+              <w:t>Expires August 31, 2026</w:t>
             </w:r>
           </w:p>
         </w:tc>

</xml_diff>